<commit_message>
Note Docker, live FX API and CI image build on the Freelance Ledger card; refresh CV
</commit_message>
<xml_diff>
--- a/Saood-Williams-CV.docx
+++ b/Saood-Williams-CV.docx
@@ -47,7 +47,7 @@
         <w:spacing w:after="60"/>
       </w:pPr>
       <w:r>
-        <w:t>Self-taught full-stack developer in Cape Town working in TypeScript, React, Next.js and Node.js, with Supabase and Postgres on the backend. I work AI-assisted with Claude Code and the Model Context Protocol, and I build MCP tooling myself. I ship end to end: data model, authentication, access rules, tested logic, CI and deploy. Open to remote roles with international teams; available through an Employer of Record or as an independent contractor.</w:t>
+        <w:t>Self-taught full-stack developer in Cape Town working in TypeScript, React, Next.js and Node.js, with Supabase and Postgres on the backend. I work AI-assisted with Claude Code and the Model Context Protocol, and I build MCP tooling myself. I ship end to end: data model, authentication, access rules, tested logic, external APIs, Docker and CI. Open to remote roles with international teams; available through an Employer of Record or as an independent contractor.</w:t>
       </w:r>
     </w:p>
     <w:p>
@@ -116,10 +116,10 @@
         <w:rPr>
           <w:b/>
         </w:rPr>
-        <w:t xml:space="preserve">Tooling and practices: </w:t>
+        <w:t xml:space="preserve">DevOps and tooling: </w:t>
       </w:r>
       <w:r>
-        <w:t>Git, GitHub, GitHub Actions, CI/CD, Vitest, unit testing, Netlify, Vercel</w:t>
+        <w:t>Docker, Docker Compose, Git, GitHub, GitHub Actions, CI/CD, Vitest, unit testing, Netlify, Vercel</w:t>
       </w:r>
     </w:p>
     <w:p>
@@ -148,20 +148,6 @@
       </w:r>
       <w:r>
         <w:t>HTTP security headers, WebGL and GLSL shaders, Chrome extensions (Manifest V3)</w:t>
-      </w:r>
-    </w:p>
-    <w:p>
-      <w:pPr>
-        <w:spacing w:after="40"/>
-      </w:pPr>
-      <w:r>
-        <w:rPr>
-          <w:b/>
-        </w:rPr>
-        <w:t xml:space="preserve">Ways of working: </w:t>
-      </w:r>
-      <w:r>
-        <w:t>Remote and async collaboration, written communication</w:t>
       </w:r>
     </w:p>
     <w:p>
@@ -213,7 +199,7 @@
         <w:spacing w:after="20"/>
       </w:pPr>
       <w:r>
-        <w:t>Currency-safe money library storing amounts in integer minor units; computes outstanding versus paid totals per currency, month-scoped income and automatic overdue detection, covered by 16 unit tests in Vitest.</w:t>
+        <w:t>Live currency conversion of multi-currency totals through the Frankfurter exchange-rate API, with a request timeout and a graceful fallback when a rate is unavailable, covered by tests.</w:t>
       </w:r>
     </w:p>
     <w:p>
@@ -222,7 +208,16 @@
         <w:spacing w:after="20"/>
       </w:pPr>
       <w:r>
-        <w:t>GitHub Actions CI runs type checking, tests and a production build on every push; Netlify deploy configured with the official Next.js plugin. MIT licensed.</w:t>
+        <w:t>Currency-safe money library storing amounts in integer minor units; computes outstanding versus paid totals per currency, month-scoped income and automatic overdue detection. 24 unit tests in Vitest.</w:t>
+      </w:r>
+    </w:p>
+    <w:p>
+      <w:pPr>
+        <w:pStyle w:val="ListBullet"/>
+        <w:spacing w:after="20"/>
+      </w:pPr>
+      <w:r>
+        <w:t>Multi-stage Docker build with Docker Compose for app and Postgres; GitHub Actions CI runs type checking, tests, a production build and a Docker image build on every push. MIT licensed.</w:t>
       </w:r>
     </w:p>
     <w:p>

</xml_diff>

<commit_message>
Add particle portrait, collaborative canvas, consensus lab and updated CV
</commit_message>
<xml_diff>
--- a/Saood-Williams-CV.docx
+++ b/Saood-Williams-CV.docx
@@ -4,72 +4,87 @@
   <w:body>
     <w:p>
       <w:pPr>
-        <w:spacing w:after="0"/>
+        <w:pStyle w:val="Title"/>
       </w:pPr>
       <w:r>
-        <w:rPr>
-          <w:b/>
-          <w:sz w:val="40"/>
-        </w:rPr>
         <w:t>Sa'ood Williams</w:t>
       </w:r>
     </w:p>
     <w:p>
+      <w:r>
+        <w:rPr>
+          <w:b/>
+        </w:rPr>
+        <w:t>FULL-STACK DEVELOPER</w:t>
+      </w:r>
+    </w:p>
+    <w:p>
+      <w:r>
+        <w:t xml:space="preserve">Cape Town, South Africa | </w:t>
+      </w:r>
+      <w:hyperlink r:id="rId9">
+        <w:r>
+          <w:rPr>
+            <w:color w:val="245675"/>
+          </w:rPr>
+          <w:t>saoodwilliams321@gmail.com</w:t>
+        </w:r>
+      </w:hyperlink>
+    </w:p>
+    <w:p>
+      <w:hyperlink r:id="rId10">
+        <w:r>
+          <w:rPr>
+            <w:color w:val="245675"/>
+          </w:rPr>
+          <w:t>Portfolio and live demos</w:t>
+        </w:r>
+      </w:hyperlink>
+      <w:r>
+        <w:t xml:space="preserve"> | </w:t>
+      </w:r>
+      <w:hyperlink r:id="rId11">
+        <w:r>
+          <w:rPr>
+            <w:color w:val="245675"/>
+          </w:rPr>
+          <w:t>GitHub: CACTUSCASH</w:t>
+        </w:r>
+      </w:hyperlink>
+      <w:r>
+        <w:t xml:space="preserve"> | </w:t>
+      </w:r>
+      <w:hyperlink r:id="rId12">
+        <w:r>
+          <w:rPr>
+            <w:color w:val="245675"/>
+          </w:rPr>
+          <w:t>LinkedIn</w:t>
+        </w:r>
+      </w:hyperlink>
+    </w:p>
+    <w:p>
       <w:pPr>
-        <w:spacing w:after="120"/>
+        <w:pStyle w:val="Heading1"/>
       </w:pPr>
       <w:r>
-        <w:rPr>
-          <w:color w:val="333333"/>
-          <w:sz w:val="19"/>
-        </w:rPr>
-        <w:t>Cape Town, South Africa  |  saoodwilliams321@gmail.com  |  github.com/CACTUSCASH  |  cactuscash.github.io/saoodwilliams-com</w:t>
+        <w:t>PROFILE</w:t>
+      </w:r>
+    </w:p>
+    <w:p>
+      <w:r>
+        <w:t>Full-stack developer working with React, TypeScript, Next.js, Node.js and SQL. Founder of Cipher30, with responsibility for development, deployment and support. Independent project work covers collaborative editing, workflow execution, distributed-systems simulations and GPU graphics. Open to remote development roles and contracts.</w:t>
       </w:r>
     </w:p>
     <w:p>
       <w:pPr>
-        <w:spacing w:before="160" w:after="60"/>
-        <w:pBdr>
-          <w:bottom w:val="single" w:sz="6" w:space="1" w:color="999999"/>
-        </w:pBdr>
+        <w:pStyle w:val="Heading1"/>
       </w:pPr>
       <w:r>
-        <w:rPr>
-          <w:b/>
-          <w:color w:val="111111"/>
-          <w:sz w:val="22"/>
-        </w:rPr>
-        <w:t>SUMMARY</w:t>
+        <w:t>TECHNICAL SKILLS</w:t>
       </w:r>
     </w:p>
     <w:p>
-      <w:pPr>
-        <w:spacing w:after="60"/>
-      </w:pPr>
-      <w:r>
-        <w:t>Self-taught full-stack developer in Cape Town working in TypeScript, React, Next.js and Node.js, with Supabase and Postgres on the backend. I work AI-assisted with Claude Code and the Model Context Protocol, and I build MCP tooling myself. I ship end to end: data model, authentication, access rules, tested logic, external APIs, Docker and CI. Open to remote roles with international teams; available through an Employer of Record or as an independent contractor.</w:t>
-      </w:r>
-    </w:p>
-    <w:p>
-      <w:pPr>
-        <w:spacing w:before="160" w:after="60"/>
-        <w:pBdr>
-          <w:bottom w:val="single" w:sz="6" w:space="1" w:color="999999"/>
-        </w:pBdr>
-      </w:pPr>
-      <w:r>
-        <w:rPr>
-          <w:b/>
-          <w:color w:val="111111"/>
-          <w:sz w:val="22"/>
-        </w:rPr>
-        <w:t>SKILLS</w:t>
-      </w:r>
-    </w:p>
-    <w:p>
-      <w:pPr>
-        <w:spacing w:after="40"/>
-      </w:pPr>
       <w:r>
         <w:rPr>
           <w:b/>
@@ -77,280 +92,424 @@
         <w:t xml:space="preserve">Languages: </w:t>
       </w:r>
       <w:r>
-        <w:t>TypeScript, JavaScript, Python, HTML, CSS, SQL</w:t>
+        <w:t>TypeScript, JavaScript, Python, SQL, HTML, CSS</w:t>
+      </w:r>
+    </w:p>
+    <w:p>
+      <w:r>
+        <w:rPr>
+          <w:b/>
+        </w:rPr>
+        <w:t xml:space="preserve">Applications: </w:t>
+      </w:r>
+      <w:r>
+        <w:t>React, Next.js, Node.js, REST APIs, Server-Sent Events</w:t>
+      </w:r>
+    </w:p>
+    <w:p>
+      <w:r>
+        <w:rPr>
+          <w:b/>
+        </w:rPr>
+        <w:t xml:space="preserve">Data and graphics: </w:t>
+      </w:r>
+      <w:r>
+        <w:t>PostgreSQL, Supabase, SQLite, Row Level Security, WebGL2, GLSL, SVG</w:t>
+      </w:r>
+    </w:p>
+    <w:p>
+      <w:r>
+        <w:rPr>
+          <w:b/>
+        </w:rPr>
+        <w:t xml:space="preserve">Delivery and testing: </w:t>
+      </w:r>
+      <w:r>
+        <w:t>Git, GitHub Actions, Docker, Vercel, Node test runner, Vitest</w:t>
       </w:r>
     </w:p>
     <w:p>
       <w:pPr>
-        <w:spacing w:after="40"/>
+        <w:pStyle w:val="Heading1"/>
       </w:pPr>
       <w:r>
-        <w:rPr>
-          <w:b/>
-        </w:rPr>
-        <w:t xml:space="preserve">Frameworks: </w:t>
-      </w:r>
-      <w:r>
-        <w:t>React, Next.js (App Router), Node.js</w:t>
+        <w:t>EXPERIENCE</w:t>
       </w:r>
     </w:p>
     <w:p>
       <w:pPr>
-        <w:spacing w:after="40"/>
+        <w:pStyle w:val="Heading2"/>
       </w:pPr>
       <w:r>
-        <w:rPr>
-          <w:b/>
-        </w:rPr>
-        <w:t xml:space="preserve">Backend and data: </w:t>
-      </w:r>
-      <w:r>
-        <w:t>Supabase, PostgreSQL, Row Level Security, REST APIs, Server Actions</w:t>
+        <w:t>Founder &amp; Full-Stack Developer | Cipher30</w:t>
       </w:r>
     </w:p>
     <w:p>
-      <w:pPr>
-        <w:spacing w:after="40"/>
-      </w:pPr>
       <w:r>
-        <w:rPr>
-          <w:b/>
-        </w:rPr>
-        <w:t xml:space="preserve">DevOps and tooling: </w:t>
-      </w:r>
-      <w:r>
-        <w:t>Docker, Docker Compose, Git, GitHub, GitHub Actions, CI/CD, Vitest, unit testing, Netlify, Vercel</w:t>
-      </w:r>
-    </w:p>
-    <w:p>
-      <w:pPr>
-        <w:spacing w:after="40"/>
-      </w:pPr>
-      <w:r>
-        <w:rPr>
-          <w:b/>
-        </w:rPr>
-        <w:t xml:space="preserve">AI engineering: </w:t>
-      </w:r>
-      <w:r>
-        <w:t>Claude Code, Model Context Protocol servers, building and profiling MCP tooling</w:t>
-      </w:r>
-    </w:p>
-    <w:p>
-      <w:pPr>
-        <w:spacing w:after="40"/>
-      </w:pPr>
-      <w:r>
-        <w:rPr>
-          <w:b/>
-        </w:rPr>
-        <w:t xml:space="preserve">Specialisms: </w:t>
-      </w:r>
-      <w:r>
-        <w:t>HTTP security headers, WebGL and GLSL shaders, Chrome extensions (Manifest V3)</w:t>
-      </w:r>
-    </w:p>
-    <w:p>
-      <w:pPr>
-        <w:spacing w:before="160" w:after="60"/>
-        <w:pBdr>
-          <w:bottom w:val="single" w:sz="6" w:space="1" w:color="999999"/>
-        </w:pBdr>
-      </w:pPr>
-      <w:r>
-        <w:rPr>
-          <w:b/>
-          <w:color w:val="111111"/>
-          <w:sz w:val="22"/>
-        </w:rPr>
-        <w:t>PROJECTS</w:t>
-      </w:r>
-    </w:p>
-    <w:p>
-      <w:pPr>
-        <w:spacing w:before="60" w:after="20"/>
-      </w:pPr>
-      <w:r>
-        <w:rPr>
-          <w:b/>
-        </w:rPr>
-        <w:t>Freelance Ledger</w:t>
-      </w:r>
-      <w:r>
-        <w:rPr>
-          <w:color w:val="555555"/>
-          <w:sz w:val="18"/>
-        </w:rPr>
-        <w:t xml:space="preserve">   github.com/CACTUSCASH/freelance-ledger</w:t>
+        <w:t>Self-employed | January 2024 to present | Cape Town / Remote</w:t>
       </w:r>
     </w:p>
     <w:p>
       <w:pPr>
         <w:pStyle w:val="ListBullet"/>
-        <w:spacing w:after="20"/>
       </w:pPr>
       <w:r>
-        <w:t>Full-stack invoicing and income tracker in Next.js 14, TypeScript and Supabase, with email-link authentication and per-user Postgres row level security across clients, invoices and line items.</w:t>
+        <w:t>Develop and operate an online education platform using Next.js, React and TypeScript; manage deployments, hosting, domains, DNS and first-line support.</w:t>
       </w:r>
     </w:p>
     <w:p>
       <w:pPr>
         <w:pStyle w:val="ListBullet"/>
-        <w:spacing w:after="20"/>
       </w:pPr>
       <w:r>
-        <w:t>Live currency conversion of multi-currency totals through the Frankfurter exchange-rate API, with a request timeout and a graceful fallback when a rate is unavailable, covered by tests.</w:t>
+        <w:t>Resolved iOS Safari scroll performance problems by removing conflicting scroll behaviour, scheduling carousel updates with requestAnimationFrame and isolating frequent clock updates.</w:t>
       </w:r>
     </w:p>
     <w:p>
       <w:pPr>
         <w:pStyle w:val="ListBullet"/>
-        <w:spacing w:after="20"/>
       </w:pPr>
       <w:r>
-        <w:t>Currency-safe money library storing amounts in integer minor units; computes outstanding versus paid totals per currency, month-scoped income and automatic overdue detection. 24 unit tests in Vitest.</w:t>
+        <w:t>Built a Node.js and discord.js lead-capture bot backed by SQLite, with source attribution, pipeline tracking and paid-member role commands.</w:t>
+      </w:r>
+    </w:p>
+    <w:p>
+      <w:hyperlink r:id="rId13">
+        <w:r>
+          <w:rPr>
+            <w:color w:val="245675"/>
+          </w:rPr>
+          <w:t>cipher30mentorship.com</w:t>
+        </w:r>
+      </w:hyperlink>
+    </w:p>
+    <w:p>
+      <w:pPr>
+        <w:pStyle w:val="Heading1"/>
+      </w:pPr>
+      <w:r>
+        <w:t>SELECTED INDEPENDENT PROJECTS | 2026</w:t>
+      </w:r>
+    </w:p>
+    <w:p>
+      <w:pPr>
+        <w:pStyle w:val="Heading2"/>
+      </w:pPr>
+      <w:r>
+        <w:t>Canvas Rooms | JavaScript / Node.js / SQLite</w:t>
+      </w:r>
+    </w:p>
+    <w:p>
+      <w:pPr>
+        <w:spacing w:after="100"/>
+      </w:pPr>
+      <w:hyperlink r:id="rId14">
+        <w:r>
+          <w:rPr>
+            <w:color w:val="245675"/>
+          </w:rPr>
+          <w:t>github.com/CACTUSCASH/canvas-rooms</w:t>
+        </w:r>
+      </w:hyperlink>
+    </w:p>
+    <w:p>
+      <w:pPr>
+        <w:pStyle w:val="ListBullet"/>
+      </w:pPr>
+      <w:r>
+        <w:t>Built a collaborative SVG diagram editor with shape editing, local persistence, JSON and SVG export, and real browser-tab presence.</w:t>
       </w:r>
     </w:p>
     <w:p>
       <w:pPr>
         <w:pStyle w:val="ListBullet"/>
-        <w:spacing w:after="20"/>
       </w:pPr>
       <w:r>
-        <w:t>Multi-stage Docker build with Docker Compose for app and Postgres; GitHub Actions CI runs type checking, tests, a production build and a Docker image build on every push. MIT licensed.</w:t>
+        <w:t>Implemented deterministic operation merging and deletion tombstones, with an optional SQLite-backed room service using Server-Sent Events and HTTP writes.</w:t>
       </w:r>
     </w:p>
     <w:p>
       <w:pPr>
-        <w:spacing w:before="60" w:after="20"/>
+        <w:pStyle w:val="Heading2"/>
       </w:pPr>
       <w:r>
-        <w:rPr>
-          <w:b/>
-        </w:rPr>
-        <w:t>Cipher30 Mentorship</w:t>
+        <w:t>Quorum Lab | JavaScript / Distributed systems</w:t>
       </w:r>
+    </w:p>
+    <w:p>
+      <w:pPr>
+        <w:spacing w:after="100"/>
+      </w:pPr>
+      <w:hyperlink r:id="rId15">
+        <w:r>
+          <w:rPr>
+            <w:color w:val="245675"/>
+          </w:rPr>
+          <w:t>github.com/CACTUSCASH/quorum-lab</w:t>
+        </w:r>
+      </w:hyperlink>
+    </w:p>
+    <w:p>
+      <w:pPr>
+        <w:pStyle w:val="ListBullet"/>
+      </w:pPr>
       <w:r>
-        <w:rPr>
-          <w:color w:val="555555"/>
-          <w:sz w:val="18"/>
-        </w:rPr>
-        <w:t xml:space="preserve">   cipher30mentorship.com</w:t>
+        <w:t>Built a deterministic five-node consensus simulator with elections, log replication, majority commits, network partitions and crash recovery.</w:t>
       </w:r>
     </w:p>
     <w:p>
       <w:pPr>
         <w:pStyle w:val="ListBullet"/>
-        <w:spacing w:after="20"/>
       </w:pPr>
       <w:r>
-        <w:t>Designed, built and run a live mentorship web product on my own for about two and a half years, including code, deploys, payments and support.</w:t>
+        <w:t>Tested log safety, stale-leader behaviour and recovery across seeded fault schedules. This is an educational simulator, not a production cluster.</w:t>
+      </w:r>
+    </w:p>
+    <w:p>
+      <w:r>
+        <w:br w:type="page"/>
       </w:r>
     </w:p>
     <w:p>
       <w:pPr>
-        <w:spacing w:before="60" w:after="20"/>
+        <w:pStyle w:val="Heading1"/>
       </w:pPr>
       <w:r>
-        <w:rPr>
-          <w:b/>
-        </w:rPr>
-        <w:t>MCP developer tooling</w:t>
+        <w:t>Sa'ood Williams | Project work</w:t>
       </w:r>
+    </w:p>
+    <w:p>
+      <w:pPr>
+        <w:pStyle w:val="Heading2"/>
+      </w:pPr>
       <w:r>
-        <w:rPr>
-          <w:color w:val="555555"/>
-          <w:sz w:val="18"/>
-        </w:rPr>
-        <w:t xml:space="preserve">   github.com/CACTUSCASH</w:t>
+        <w:t>Relay Workflows | Node.js / SQLite</w:t>
+      </w:r>
+    </w:p>
+    <w:p>
+      <w:pPr>
+        <w:spacing w:after="100"/>
+      </w:pPr>
+      <w:hyperlink r:id="rId16">
+        <w:r>
+          <w:rPr>
+            <w:color w:val="245675"/>
+          </w:rPr>
+          <w:t>github.com/CACTUSCASH/relay-workflows</w:t>
+        </w:r>
+      </w:hyperlink>
+    </w:p>
+    <w:p>
+      <w:pPr>
+        <w:pStyle w:val="ListBullet"/>
+      </w:pPr>
+      <w:r>
+        <w:t>Implemented a shared workflow execution engine with validated graphs, typed transforms, conditional branches, payload traces and retry fixtures.</w:t>
       </w:r>
     </w:p>
     <w:p>
       <w:pPr>
         <w:pStyle w:val="ListBullet"/>
-        <w:spacing w:after="20"/>
       </w:pPr>
       <w:r>
-        <w:t>mcp-headers: Model Context Protocol server in TypeScript that scans a site's HTTP security headers and grades them A to F against OWASP guidance, using the official MCP SDK.</w:t>
+        <w:t>Persisted workflow and execution history in SQLite and verified recovery after server restarts. Hosted demo runs locally in the browser; HTTP steps are labelled simulations.</w:t>
+      </w:r>
+    </w:p>
+    <w:p>
+      <w:pPr>
+        <w:pStyle w:val="Heading2"/>
+      </w:pPr>
+      <w:r>
+        <w:t>Spectra Studio | WebGL2 / GLSL</w:t>
+      </w:r>
+    </w:p>
+    <w:p>
+      <w:pPr>
+        <w:spacing w:after="100"/>
+      </w:pPr>
+      <w:hyperlink r:id="rId17">
+        <w:r>
+          <w:rPr>
+            <w:color w:val="245675"/>
+          </w:rPr>
+          <w:t>github.com/CACTUSCASH/spectra-studio</w:t>
+        </w:r>
+      </w:hyperlink>
+    </w:p>
+    <w:p>
+      <w:pPr>
+        <w:pStyle w:val="ListBullet"/>
+      </w:pPr>
+      <w:r>
+        <w:t>Built a live fragment-shader editor with five presets, portable saved patches and PNG export.</w:t>
       </w:r>
     </w:p>
     <w:p>
       <w:pPr>
         <w:pStyle w:val="ListBullet"/>
-        <w:spacing w:after="20"/>
       </w:pPr>
       <w:r>
-        <w:t>mcp-sqlite: MCP server giving an assistant safe, read-only SQLite access (list tables, inspect schema, run SELECT), with zero native dependencies using Node's built-in SQLite.</w:t>
+        <w:t>Kept the previous shader active after compilation errors, cached uniforms and GPU resources, and stopped rendering when the canvas is hidden.</w:t>
+      </w:r>
+    </w:p>
+    <w:p>
+      <w:pPr>
+        <w:pStyle w:val="Heading2"/>
+      </w:pPr>
+      <w:r>
+        <w:t>Atlas Pathfinder | Algorithms / Web Workers</w:t>
+      </w:r>
+    </w:p>
+    <w:p>
+      <w:pPr>
+        <w:spacing w:after="100"/>
+      </w:pPr>
+      <w:hyperlink r:id="rId18">
+        <w:r>
+          <w:rPr>
+            <w:color w:val="245675"/>
+          </w:rPr>
+          <w:t>github.com/CACTUSCASH/atlas-pathfinder</w:t>
+        </w:r>
+      </w:hyperlink>
+    </w:p>
+    <w:p>
+      <w:pPr>
+        <w:pStyle w:val="ListBullet"/>
+      </w:pPr>
+      <w:r>
+        <w:t>Implemented A*, Dijkstra and breadth-first search on editable weighted maps with comparison, pause and single-step playback.</w:t>
       </w:r>
     </w:p>
     <w:p>
       <w:pPr>
         <w:pStyle w:val="ListBullet"/>
-        <w:spacing w:after="20"/>
       </w:pPr>
       <w:r>
-        <w:t>claude-mcp-profiler: command-line tool that profiles MCP tool calls to find slow ones.</w:t>
+        <w:t>Checked shortest-path results against an independent reference across 120 seeded maps; tested maze connectivity, worker execution and malformed imports.</w:t>
       </w:r>
     </w:p>
     <w:p>
       <w:pPr>
-        <w:spacing w:before="60" w:after="20"/>
+        <w:pStyle w:val="Heading2"/>
       </w:pPr>
       <w:r>
-        <w:rPr>
-          <w:b/>
-        </w:rPr>
-        <w:t>Front-end and graphics</w:t>
+        <w:t>Freelance Ledger | Next.js / TypeScript / Supabase</w:t>
       </w:r>
+    </w:p>
+    <w:p>
+      <w:pPr>
+        <w:spacing w:after="100"/>
+      </w:pPr>
+      <w:hyperlink r:id="rId19">
+        <w:r>
+          <w:rPr>
+            <w:color w:val="245675"/>
+          </w:rPr>
+          <w:t>github.com/CACTUSCASH/freelance-ledger</w:t>
+        </w:r>
+      </w:hyperlink>
+    </w:p>
+    <w:p>
+      <w:pPr>
+        <w:pStyle w:val="ListBullet"/>
+      </w:pPr>
       <w:r>
-        <w:rPr>
-          <w:color w:val="555555"/>
-          <w:sz w:val="18"/>
-        </w:rPr>
-        <w:t xml:space="preserve">   github.com/CACTUSCASH</w:t>
+        <w:t>Built invoicing with email-link authentication, account-scoped PostgreSQL access rules and money calculations in integer minor units.</w:t>
       </w:r>
     </w:p>
     <w:p>
       <w:pPr>
         <w:pStyle w:val="ListBullet"/>
-        <w:spacing w:after="20"/>
       </w:pPr>
       <w:r>
-        <w:t>WebGL and GLSL shader work (shader-play, nextjs-cinematic-hero) and front-end performance work (nextjs-ios-scroll-perf, use-scroll-pause).</w:t>
+        <w:t>Integrated currency conversion with timeout and fallback handling; included Docker configuration and CI checks in the repository.</w:t>
       </w:r>
     </w:p>
     <w:p>
       <w:pPr>
-        <w:spacing w:before="160" w:after="60"/>
-        <w:pBdr>
-          <w:bottom w:val="single" w:sz="6" w:space="1" w:color="999999"/>
-        </w:pBdr>
+        <w:pStyle w:val="Heading2"/>
       </w:pPr>
       <w:r>
-        <w:rPr>
-          <w:b/>
-          <w:color w:val="111111"/>
-          <w:sz w:val="22"/>
-        </w:rPr>
+        <w:t>Further project work</w:t>
+      </w:r>
+    </w:p>
+    <w:p>
+      <w:r>
+        <w:t>Orbit Workspace provides task editing, drag-and-drop, filtering and local persistence. Prism Analytics validates CSV imports, calculates revenue totals and exports filtered records. Both include local Node.js / SQLite backends. Additional repositories cover HTTP security-header reporting, MCP tools and GPU particle graphics.</w:t>
+      </w:r>
+    </w:p>
+    <w:p>
+      <w:pPr>
+        <w:pStyle w:val="Heading1"/>
+      </w:pPr>
+      <w:r>
         <w:t>EDUCATION</w:t>
       </w:r>
     </w:p>
     <w:p>
       <w:pPr>
-        <w:spacing w:after="60"/>
+        <w:pStyle w:val="Heading2"/>
       </w:pPr>
       <w:r>
-        <w:t>Higher Certificate in Information Systems (Cyber Security), Eduvos. Completed May 2026.</w:t>
+        <w:t>Higher Certificate in Information Systems (Cyber Security)</w:t>
+      </w:r>
+    </w:p>
+    <w:p>
+      <w:r>
+        <w:t>Eduvos | Completed</w:t>
+      </w:r>
+    </w:p>
+    <w:p>
+      <w:pPr>
+        <w:pStyle w:val="Heading1"/>
+      </w:pPr>
+      <w:r>
+        <w:t>PROJECT DEMOS AND SOURCE</w:t>
+      </w:r>
+    </w:p>
+    <w:p>
+      <w:hyperlink r:id="rId10">
+        <w:r>
+          <w:rPr>
+            <w:color w:val="245675"/>
+          </w:rPr>
+          <w:t>cactuscash.github.io/saoodwilliams-com</w:t>
+        </w:r>
+      </w:hyperlink>
+    </w:p>
+    <w:p>
+      <w:r>
+        <w:t>Hosted demonstrations run in the browser. Node.js / SQLite services are available in the source repositories for local use. Documentation describes setup, tests and project limitations.</w:t>
       </w:r>
     </w:p>
     <w:sectPr>
-      <w:pgSz w:w="12240" w:h="15840"/>
+      <w:footerReference w:type="default" r:id="rId20"/>
+      <w:pgSz w:w="11909" w:h="16834"/>
       <w:pgMar w:top="864" w:right="1008" w:bottom="864" w:left="1008" w:header="720" w:footer="720" w:gutter="0"/>
       <w:cols w:space="720"/>
       <w:docGrid w:linePitch="360"/>
     </w:sectPr>
   </w:body>
 </w:document>
+</file>
+
+<file path=word/footer1.xml><?xml version="1.0" encoding="utf-8"?>
+<w:ftr xmlns:m="http://schemas.openxmlformats.org/officeDocument/2006/math" xmlns:mc="http://schemas.openxmlformats.org/markup-compatibility/2006" xmlns:mo="http://schemas.microsoft.com/office/mac/office/2008/main" xmlns:mv="urn:schemas-microsoft-com:mac:vml" xmlns:o="urn:schemas-microsoft-com:office:office" xmlns:r="http://schemas.openxmlformats.org/officeDocument/2006/relationships" xmlns:v="urn:schemas-microsoft-com:vml" xmlns:w10="urn:schemas-microsoft-com:office:word" xmlns:w14="http://schemas.microsoft.com/office/word/2010/wordml" xmlns:w="http://schemas.openxmlformats.org/wordprocessingml/2006/main" xmlns:wne="http://schemas.microsoft.com/office/word/2006/wordml" xmlns:wp14="http://schemas.microsoft.com/office/word/2010/wordprocessingDrawing" xmlns:wp="http://schemas.openxmlformats.org/drawingml/2006/wordprocessingDrawing" xmlns:wpc="http://schemas.microsoft.com/office/word/2010/wordprocessingCanvas" xmlns:wpg="http://schemas.microsoft.com/office/word/2010/wordprocessingGroup" xmlns:wpi="http://schemas.microsoft.com/office/word/2010/wordprocessingInk" xmlns:wps="http://schemas.microsoft.com/office/word/2010/wordprocessingShape" mc:Ignorable="w14 wp14">
+  <w:p>
+    <w:pPr>
+      <w:pStyle w:val="Footer"/>
+      <w:jc w:val="right"/>
+    </w:pPr>
+    <w:r>
+      <w:rPr>
+        <w:sz w:val="16"/>
+      </w:rPr>
+      <w:t xml:space="preserve">Sa'ood Williams | </w:t>
+    </w:r>
+    <w:fldSimple w:instr="PAGE"/>
+  </w:p>
+</w:ftr>
 </file>
 
 <file path=word/numbering.xml><?xml version="1.0" encoding="utf-8"?>
@@ -717,10 +876,11 @@
     <w:qFormat/>
     <w:rsid w:val="00FC693F"/>
     <w:pPr>
-      <w:spacing w:after="40" w:line="252" w:lineRule="auto"/>
+      <w:spacing w:after="100" w:line="252" w:lineRule="auto"/>
     </w:pPr>
     <w:rPr>
       <w:rFonts w:ascii="Calibri" w:hAnsi="Calibri"/>
+      <w:color w:val="20282F"/>
       <w:sz w:val="21"/>
     </w:rPr>
   </w:style>
@@ -779,15 +939,15 @@
     <w:pPr>
       <w:keepNext/>
       <w:keepLines/>
-      <w:spacing w:before="480" w:after="0"/>
+      <w:spacing w:before="200" w:after="100"/>
       <w:outlineLvl w:val="0"/>
     </w:pPr>
     <w:rPr>
-      <w:rFonts w:asciiTheme="majorHAnsi" w:eastAsiaTheme="majorEastAsia" w:hAnsiTheme="majorHAnsi" w:cstheme="majorBidi"/>
+      <w:rFonts w:asciiTheme="majorHAnsi" w:eastAsiaTheme="majorEastAsia" w:hAnsiTheme="majorHAnsi" w:cstheme="majorBidi" w:ascii="Calibri" w:hAnsi="Calibri"/>
       <w:b/>
       <w:bCs/>
-      <w:color w:val="365F91" w:themeColor="accent1" w:themeShade="BF"/>
-      <w:sz w:val="28"/>
+      <w:color w:val="1C3548"/>
+      <w:sz w:val="24"/>
       <w:szCs w:val="28"/>
     </w:rPr>
   </w:style>
@@ -803,15 +963,15 @@
     <w:pPr>
       <w:keepNext/>
       <w:keepLines/>
-      <w:spacing w:before="200" w:after="0"/>
+      <w:spacing w:before="200" w:after="100"/>
       <w:outlineLvl w:val="1"/>
     </w:pPr>
     <w:rPr>
-      <w:rFonts w:asciiTheme="majorHAnsi" w:eastAsiaTheme="majorEastAsia" w:hAnsiTheme="majorHAnsi" w:cstheme="majorBidi"/>
+      <w:rFonts w:asciiTheme="majorHAnsi" w:eastAsiaTheme="majorEastAsia" w:hAnsiTheme="majorHAnsi" w:cstheme="majorBidi" w:ascii="Calibri" w:hAnsi="Calibri"/>
       <w:b/>
       <w:bCs/>
-      <w:color w:val="4F81BD" w:themeColor="accent1"/>
-      <w:sz w:val="26"/>
+      <w:color w:val="1C3548"/>
+      <w:sz w:val="22"/>
       <w:szCs w:val="26"/>
     </w:rPr>
   </w:style>
@@ -1065,18 +1225,20 @@
     <w:qFormat/>
     <w:rsid w:val="00FC693F"/>
     <w:pPr>
+      <w:keepNext/>
       <w:pBdr>
         <w:bottom w:val="single" w:sz="8" w:space="4" w:color="4F81BD" w:themeColor="accent1"/>
       </w:pBdr>
-      <w:spacing w:after="300" w:line="240" w:lineRule="auto"/>
+      <w:spacing w:after="100" w:line="240" w:lineRule="auto" w:before="200"/>
       <w:contextualSpacing/>
     </w:pPr>
     <w:rPr>
-      <w:rFonts w:asciiTheme="majorHAnsi" w:eastAsiaTheme="majorEastAsia" w:hAnsiTheme="majorHAnsi" w:cstheme="majorBidi"/>
-      <w:color w:val="17365D" w:themeColor="text2" w:themeShade="BF"/>
+      <w:rFonts w:asciiTheme="majorHAnsi" w:eastAsiaTheme="majorEastAsia" w:hAnsiTheme="majorHAnsi" w:cstheme="majorBidi" w:ascii="Calibri" w:hAnsi="Calibri"/>
+      <w:b/>
+      <w:color w:val="1C3548"/>
       <w:spacing w:val="5"/>
       <w:kern w:val="28"/>
-      <w:sz w:val="52"/>
+      <w:sz w:val="56"/>
       <w:szCs w:val="52"/>
     </w:rPr>
   </w:style>
@@ -1250,6 +1412,7 @@
       <w:numPr>
         <w:numId w:val="1"/>
       </w:numPr>
+      <w:spacing w:after="80" w:line="247" w:lineRule="auto"/>
       <w:contextualSpacing/>
     </w:pPr>
   </w:style>

</xml_diff>